<commit_message>
nmv 05 10 2026
</commit_message>
<xml_diff>
--- a/TS-Kramam/TS-6.4/TS 6.4 Malayalam Krama Paatam Corrections.docx
+++ b/TS-Kramam/TS-6.4/TS 6.4 Malayalam Krama Paatam Corrections.docx
@@ -89,10 +89,49 @@
           <w:bCs/>
           <w:sz w:val="32"/>
           <w:szCs w:val="32"/>
-          <w:highlight w:val="red"/>
           <w:u w:val="single"/>
         </w:rPr>
-        <w:t>????</w:t>
+        <w:t>3</w:t>
+      </w:r>
+      <w:r>
+        <w:rPr>
+          <w:b/>
+          <w:bCs/>
+          <w:sz w:val="32"/>
+          <w:szCs w:val="32"/>
+          <w:u w:val="single"/>
+        </w:rPr>
+        <w:t>1st</w:t>
+      </w:r>
+      <w:r>
+        <w:rPr>
+          <w:b/>
+          <w:bCs/>
+          <w:sz w:val="32"/>
+          <w:szCs w:val="32"/>
+          <w:u w:val="single"/>
+        </w:rPr>
+        <w:t xml:space="preserve"> </w:t>
+      </w:r>
+      <w:r>
+        <w:rPr>
+          <w:b/>
+          <w:bCs/>
+          <w:sz w:val="32"/>
+          <w:szCs w:val="32"/>
+          <w:u w:val="single"/>
+        </w:rPr>
+        <w:t>Oct</w:t>
+      </w:r>
+      <w:r>
+        <w:rPr>
+          <w:b/>
+          <w:bCs/>
+          <w:sz w:val="32"/>
+          <w:szCs w:val="32"/>
+          <w:u w:val="single"/>
+        </w:rPr>
+        <w:t xml:space="preserve"> 2026</w:t>
       </w:r>
     </w:p>
     <w:p>
@@ -1927,28 +1966,18 @@
                 <w:b/>
                 <w:sz w:val="28"/>
                 <w:szCs w:val="32"/>
-                <w:lang w:val="it-IT"/>
-              </w:rPr>
-            </w:pPr>
-            <w:r>
-              <w:rPr>
-                <w:rFonts w:cs="Arial"/>
-                <w:b/>
-                <w:sz w:val="28"/>
-                <w:szCs w:val="32"/>
-                <w:lang w:val="it-IT"/>
-              </w:rPr>
-              <w:t>Krama Vaakyam No.–</w:t>
-            </w:r>
-            <w:r>
-              <w:rPr>
-                <w:rFonts w:cs="Arial"/>
-                <w:b/>
-                <w:sz w:val="28"/>
-                <w:szCs w:val="32"/>
-                <w:lang w:val="it-IT"/>
-              </w:rPr>
-              <w:t>7</w:t>
+                <w:lang w:val="en-IN"/>
+              </w:rPr>
+            </w:pPr>
+            <w:r>
+              <w:rPr>
+                <w:rFonts w:cs="Arial"/>
+                <w:b/>
+                <w:sz w:val="28"/>
+                <w:szCs w:val="32"/>
+                <w:lang w:val="en-IN"/>
+              </w:rPr>
+              <w:t>Krama Vaakyam No.–7</w:t>
             </w:r>
           </w:p>
           <w:p>
@@ -2436,28 +2465,18 @@
                 <w:b/>
                 <w:sz w:val="28"/>
                 <w:szCs w:val="32"/>
-                <w:lang w:val="it-IT"/>
-              </w:rPr>
-            </w:pPr>
-            <w:r>
-              <w:rPr>
-                <w:rFonts w:cs="Arial"/>
-                <w:b/>
-                <w:sz w:val="28"/>
-                <w:szCs w:val="32"/>
-                <w:lang w:val="it-IT"/>
-              </w:rPr>
-              <w:t>Krama Vaakyam No.–</w:t>
-            </w:r>
-            <w:r>
-              <w:rPr>
-                <w:rFonts w:cs="Arial"/>
-                <w:b/>
-                <w:sz w:val="28"/>
-                <w:szCs w:val="32"/>
-                <w:lang w:val="it-IT"/>
-              </w:rPr>
-              <w:t>34</w:t>
+                <w:lang w:val="en-IN"/>
+              </w:rPr>
+            </w:pPr>
+            <w:r>
+              <w:rPr>
+                <w:rFonts w:cs="Arial"/>
+                <w:b/>
+                <w:sz w:val="28"/>
+                <w:szCs w:val="32"/>
+                <w:lang w:val="en-IN"/>
+              </w:rPr>
+              <w:t>Krama Vaakyam No.–34</w:t>
             </w:r>
           </w:p>
           <w:p>
@@ -2503,17 +2522,7 @@
                 <w:szCs w:val="32"/>
                 <w:lang w:val="it-IT"/>
               </w:rPr>
-              <w:t>4</w:t>
-            </w:r>
-            <w:r>
-              <w:rPr>
-                <w:rFonts w:cs="Arial"/>
-                <w:b/>
-                <w:sz w:val="28"/>
-                <w:szCs w:val="32"/>
-                <w:lang w:val="it-IT"/>
-              </w:rPr>
-              <w:t>2</w:t>
+              <w:t>42</w:t>
             </w:r>
           </w:p>
         </w:tc>
@@ -11165,7 +11174,16 @@
           <w:bCs/>
           <w:sz w:val="32"/>
         </w:rPr>
-        <w:t>replaced with</w:t>
+        <w:t xml:space="preserve">replaced </w:t>
+      </w:r>
+      <w:proofErr w:type="gramStart"/>
+      <w:r>
+        <w:rPr>
+          <w:b/>
+          <w:bCs/>
+          <w:sz w:val="32"/>
+        </w:rPr>
+        <w:t>with</w:t>
       </w:r>
       <w:r>
         <w:rPr>
@@ -11187,6 +11205,7 @@
         </w:rPr>
         <w:t>"</w:t>
       </w:r>
+      <w:proofErr w:type="gramEnd"/>
       <w:r>
         <w:rPr>
           <w:rFonts w:ascii="BRH Malayalam" w:hAnsi="BRH Malayalam" w:cs="BRH Malayalam"/>
@@ -11198,6 +11217,7 @@
         </w:rPr>
         <w:t>q§T</w:t>
       </w:r>
+      <w:proofErr w:type="gramStart"/>
       <w:r>
         <w:rPr>
           <w:rFonts w:ascii="BRH Malayalam" w:hAnsi="BRH Malayalam" w:cs="BRH Malayalam"/>
@@ -11214,7 +11234,16 @@
           <w:bCs/>
           <w:sz w:val="32"/>
         </w:rPr>
-        <w:t>wherever applicable</w:t>
+        <w:t>wherever</w:t>
+      </w:r>
+      <w:proofErr w:type="gramEnd"/>
+      <w:r>
+        <w:rPr>
+          <w:b/>
+          <w:bCs/>
+          <w:sz w:val="32"/>
+        </w:rPr>
+        <w:t xml:space="preserve"> applicable</w:t>
       </w:r>
     </w:p>
     <w:p>
@@ -11237,28 +11266,6 @@
           <w:u w:val="single"/>
         </w:rPr>
         <w:lastRenderedPageBreak/>
-        <w:t>===========</w:t>
-      </w:r>
-    </w:p>
-    <w:p>
-      <w:pPr>
-        <w:jc w:val="center"/>
-        <w:rPr>
-          <w:b/>
-          <w:bCs/>
-          <w:sz w:val="32"/>
-          <w:szCs w:val="32"/>
-          <w:u w:val="single"/>
-        </w:rPr>
-      </w:pPr>
-      <w:r>
-        <w:rPr>
-          <w:b/>
-          <w:bCs/>
-          <w:sz w:val="32"/>
-          <w:szCs w:val="32"/>
-          <w:u w:val="single"/>
-        </w:rPr>
         <w:t xml:space="preserve">TS </w:t>
       </w:r>
       <w:r>

</xml_diff>